<commit_message>
fix #287 fix #329 fix #349 #350 #356 #355 #280 #358
</commit_message>
<xml_diff>
--- a/docassemble/MODivorceForms/data/templates/service_by_mail_notice.docx
+++ b/docassemble/MODivorceForms/data/templates/service_by_mail_notice.docx
@@ -1,127 +1,124 @@
 
 <file path=word/document.xml><?xml version="1.0" encoding="utf-8"?>
-<w:document xmlns:wpc="http://schemas.microsoft.com/office/word/2010/wordprocessingCanvas" xmlns:cx="http://schemas.microsoft.com/office/drawing/2014/chartex" xmlns:cx1="http://schemas.microsoft.com/office/drawing/2015/9/8/chartex" xmlns:cx2="http://schemas.microsoft.com/office/drawing/2015/10/21/chartex" xmlns:cx3="http://schemas.microsoft.com/office/drawing/2016/5/9/chartex" xmlns:cx4="http://schemas.microsoft.com/office/drawing/2016/5/10/chartex" xmlns:cx5="http://schemas.microsoft.com/office/drawing/2016/5/11/chartex" xmlns:cx6="http://schemas.microsoft.com/office/drawing/2016/5/12/chartex" xmlns:cx7="http://schemas.microsoft.com/office/drawing/2016/5/13/chartex" xmlns:cx8="http://schemas.microsoft.com/office/drawing/2016/5/14/chartex" xmlns:mc="http://schemas.openxmlformats.org/markup-compatibility/2006" xmlns:aink="http://schemas.microsoft.com/office/drawing/2016/ink" xmlns:am3d="http://schemas.microsoft.com/office/drawing/2017/model3d" xmlns:o="urn:schemas-microsoft-com:office:office" xmlns:oel="http://schemas.microsoft.com/office/2019/extlst" xmlns:r="http://schemas.openxmlformats.org/officeDocument/2006/relationships" xmlns:m="http://schemas.openxmlformats.org/officeDocument/2006/math" xmlns:v="urn:schemas-microsoft-com:vml" xmlns:wp14="http://schemas.microsoft.com/office/word/2010/wordprocessingDrawing" xmlns:wp="http://schemas.openxmlformats.org/drawingml/2006/wordprocessingDrawing" xmlns:w10="urn:schemas-microsoft-com:office:word" xmlns:w="http://schemas.openxmlformats.org/wordprocessingml/2006/main" xmlns:w14="http://schemas.microsoft.com/office/word/2010/wordml" xmlns:w15="http://schemas.microsoft.com/office/word/2012/wordml" xmlns:w16cex="http://schemas.microsoft.com/office/word/2018/wordml/cex" xmlns:w16cid="http://schemas.microsoft.com/office/word/2016/wordml/cid" xmlns:w16="http://schemas.microsoft.com/office/word/2018/wordml" xmlns:w16du="http://schemas.microsoft.com/office/word/2023/wordml/word16du" xmlns:w16sdtdh="http://schemas.microsoft.com/office/word/2020/wordml/sdtdatahash" xmlns:w16sdtfl="http://schemas.microsoft.com/office/word/2024/wordml/sdtformatlock" xmlns:w16se="http://schemas.microsoft.com/office/word/2015/wordml/symex" xmlns:wpg="http://schemas.microsoft.com/office/word/2010/wordprocessingGroup" xmlns:wpi="http://schemas.microsoft.com/office/word/2010/wordprocessingInk" xmlns:wne="http://schemas.microsoft.com/office/word/2006/wordml" xmlns:wps="http://schemas.microsoft.com/office/word/2010/wordprocessingShape" mc:Ignorable="w14 w15 w16se w16cid w16 w16cex w16sdtdh w16sdtfl w16du wp14">
+<w:document xmlns:o="urn:schemas-microsoft-com:office:office" xmlns:r="http://schemas.openxmlformats.org/officeDocument/2006/relationships" xmlns:v="urn:schemas-microsoft-com:vml" xmlns:w="http://schemas.openxmlformats.org/wordprocessingml/2006/main" xmlns:w10="urn:schemas-microsoft-com:office:word" xmlns:wp="http://schemas.openxmlformats.org/drawingml/2006/wordprocessingDrawing" xmlns:wps="http://schemas.microsoft.com/office/word/2010/wordprocessingShape" xmlns:wpg="http://schemas.microsoft.com/office/word/2010/wordprocessingGroup" xmlns:mc="http://schemas.openxmlformats.org/markup-compatibility/2006" xmlns:wp14="http://schemas.microsoft.com/office/word/2010/wordprocessingDrawing" xmlns:w14="http://schemas.microsoft.com/office/word/2010/wordml" xmlns:w15="http://schemas.microsoft.com/office/word/2012/wordml" mc:Ignorable="w14 wp14 w15">
   <w:body>
     <w:p>
       <w:pPr>
+        <w:pStyle w:val="Normal"/>
         <w:jc w:val="center"/>
         <w:rPr>
+          <w:highlight w:val="none"/>
+          <w:shd w:fill="auto" w:val="clear"/>
+        </w:rPr>
+      </w:pPr>
+      <w:r>
+        <w:rPr>
           <w:b/>
           <w:sz w:val="26"/>
           <w:szCs w:val="26"/>
-          <w:highlight w:val="yellow"/>
-        </w:rPr>
-      </w:pPr>
-      <w:r>
+          <w:shd w:fill="auto" w:val="clear"/>
+        </w:rPr>
+        <w:t>IN THE CIRCUIT COURT OF {{ case.county | upper }}, MISSOURI</w:t>
+      </w:r>
+    </w:p>
+    <w:p>
+      <w:pPr>
+        <w:pStyle w:val="Normal"/>
+        <w:spacing w:before="0" w:after="240"/>
+        <w:jc w:val="center"/>
         <w:rPr>
           <w:b/>
-          <w:sz w:val="26"/>
-          <w:szCs w:val="26"/>
-          <w:highlight w:val="yellow"/>
-        </w:rPr>
-        <w:t xml:space="preserve">IN THE CIRCUIT COURT OF </w:t>
-      </w:r>
-      <w:r>
-        <w:rPr>
           <w:b/>
           <w:sz w:val="26"/>
           <w:szCs w:val="26"/>
-          <w:highlight w:val="yellow"/>
-        </w:rPr>
-        <w:t>{{ case.county | upper }}</w:t>
-      </w:r>
+          <w:highlight w:val="none"/>
+          <w:shd w:fill="auto" w:val="clear"/>
+        </w:rPr>
+      </w:pPr>
       <w:r>
         <w:rPr>
           <w:b/>
           <w:sz w:val="26"/>
           <w:szCs w:val="26"/>
-          <w:highlight w:val="yellow"/>
-        </w:rPr>
-        <w:t>, MISSOURI</w:t>
-      </w:r>
-    </w:p>
-    <w:p>
-      <w:pPr>
-        <w:spacing w:after="240"/>
-        <w:jc w:val="center"/>
-        <w:rPr>
-          <w:b/>
-          <w:sz w:val="26"/>
-          <w:szCs w:val="26"/>
-          <w:highlight w:val="yellow"/>
-        </w:rPr>
-      </w:pPr>
+          <w:shd w:fill="auto" w:val="clear"/>
+        </w:rPr>
+      </w:r>
     </w:p>
     <w:tbl>
       <w:tblPr>
-        <w:tblW w:w="0" w:type="auto"/>
-        <w:tblLook w:val="04A0" w:firstRow="1" w:lastRow="0" w:firstColumn="1" w:lastColumn="0" w:noHBand="0" w:noVBand="1"/>
+        <w:tblW w:w="9360" w:type="dxa"/>
+        <w:jc w:val="left"/>
+        <w:tblInd w:w="0" w:type="dxa"/>
+        <w:tblLayout w:type="fixed"/>
+        <w:tblCellMar>
+          <w:top w:w="0" w:type="dxa"/>
+          <w:left w:w="108" w:type="dxa"/>
+          <w:bottom w:w="0" w:type="dxa"/>
+          <w:right w:w="108" w:type="dxa"/>
+        </w:tblCellMar>
+        <w:tblLook w:val="04a0" w:noHBand="0" w:noVBand="1" w:firstColumn="1" w:lastRow="0" w:lastColumn="0" w:firstRow="1"/>
       </w:tblPr>
       <w:tblGrid>
-        <w:gridCol w:w="2477"/>
+        <w:gridCol w:w="2476"/>
         <w:gridCol w:w="2512"/>
-        <w:gridCol w:w="303"/>
-        <w:gridCol w:w="4068"/>
+        <w:gridCol w:w="304"/>
+        <w:gridCol w:w="4067"/>
       </w:tblGrid>
       <w:tr>
+        <w:trPr/>
         <w:tc>
           <w:tcPr>
-            <w:tcW w:w="5058" w:type="dxa"/>
+            <w:tcW w:w="4988" w:type="dxa"/>
             <w:gridSpan w:val="2"/>
+            <w:tcBorders/>
           </w:tcPr>
           <w:p>
             <w:pPr>
+              <w:pStyle w:val="Normal"/>
+              <w:widowControl w:val="false"/>
               <w:tabs>
-                <w:tab w:val="left" w:pos="890"/>
+                <w:tab w:val="clear" w:pos="720"/>
+                <w:tab w:val="left" w:pos="890" w:leader="none"/>
               </w:tabs>
               <w:jc w:val="both"/>
               <w:rPr>
-                <w:bCs/>
-                <w:sz w:val="26"/>
-                <w:szCs w:val="26"/>
-                <w:highlight w:val="yellow"/>
-              </w:rPr>
-            </w:pPr>
-            <w:r>
-              <w:rPr>
-                <w:bCs/>
-                <w:sz w:val="26"/>
-                <w:szCs w:val="26"/>
-                <w:highlight w:val="yellow"/>
+                <w:highlight w:val="none"/>
+                <w:shd w:fill="auto" w:val="clear"/>
+              </w:rPr>
+            </w:pPr>
+            <w:r>
+              <w:rPr>
+                <w:bCs/>
+                <w:sz w:val="26"/>
+                <w:szCs w:val="26"/>
+                <w:shd w:fill="auto" w:val="clear"/>
               </w:rPr>
               <w:t>In Re the Matter of:</w:t>
-            </w:r>
-            <w:r>
-              <w:rPr>
-                <w:bCs/>
-                <w:sz w:val="26"/>
-                <w:szCs w:val="26"/>
-                <w:highlight w:val="yellow"/>
-              </w:rPr>
               <w:tab/>
             </w:r>
           </w:p>
         </w:tc>
         <w:tc>
           <w:tcPr>
-            <w:tcW w:w="303" w:type="dxa"/>
+            <w:tcW w:w="304" w:type="dxa"/>
+            <w:tcBorders/>
           </w:tcPr>
           <w:p>
             <w:pPr>
+              <w:pStyle w:val="Normal"/>
+              <w:widowControl w:val="false"/>
               <w:jc w:val="center"/>
               <w:rPr>
-                <w:bCs/>
-                <w:sz w:val="26"/>
-                <w:szCs w:val="26"/>
-                <w:highlight w:val="yellow"/>
-              </w:rPr>
-            </w:pPr>
-            <w:r>
-              <w:rPr>
-                <w:bCs/>
-                <w:sz w:val="26"/>
-                <w:szCs w:val="26"/>
-                <w:highlight w:val="yellow"/>
+                <w:highlight w:val="none"/>
+                <w:shd w:fill="auto" w:val="clear"/>
+              </w:rPr>
+            </w:pPr>
+            <w:r>
+              <w:rPr>
+                <w:bCs/>
+                <w:sz w:val="26"/>
+                <w:szCs w:val="26"/>
+                <w:shd w:fill="auto" w:val="clear"/>
               </w:rPr>
               <w:t>)</w:t>
             </w:r>
@@ -129,59 +126,86 @@
         </w:tc>
         <w:tc>
           <w:tcPr>
-            <w:tcW w:w="4140" w:type="dxa"/>
+            <w:tcW w:w="4067" w:type="dxa"/>
+            <w:tcBorders/>
           </w:tcPr>
           <w:p>
             <w:pPr>
+              <w:pStyle w:val="Normal"/>
+              <w:widowControl w:val="false"/>
               <w:jc w:val="center"/>
               <w:rPr>
                 <w:b/>
-                <w:sz w:val="26"/>
-                <w:szCs w:val="26"/>
-                <w:highlight w:val="yellow"/>
-              </w:rPr>
-            </w:pPr>
+                <w:b/>
+                <w:sz w:val="26"/>
+                <w:szCs w:val="26"/>
+                <w:highlight w:val="none"/>
+                <w:shd w:fill="auto" w:val="clear"/>
+              </w:rPr>
+            </w:pPr>
+            <w:r>
+              <w:rPr>
+                <w:b/>
+                <w:sz w:val="26"/>
+                <w:szCs w:val="26"/>
+                <w:shd w:fill="auto" w:val="clear"/>
+              </w:rPr>
+            </w:r>
           </w:p>
         </w:tc>
       </w:tr>
       <w:tr>
+        <w:trPr/>
         <w:tc>
           <w:tcPr>
-            <w:tcW w:w="5058" w:type="dxa"/>
+            <w:tcW w:w="4988" w:type="dxa"/>
             <w:gridSpan w:val="2"/>
+            <w:tcBorders/>
           </w:tcPr>
           <w:p>
             <w:pPr>
+              <w:pStyle w:val="Normal"/>
+              <w:widowControl w:val="false"/>
               <w:jc w:val="center"/>
               <w:rPr>
                 <w:bCs/>
                 <w:sz w:val="26"/>
                 <w:szCs w:val="26"/>
-                <w:highlight w:val="yellow"/>
-              </w:rPr>
-            </w:pPr>
+                <w:highlight w:val="none"/>
+                <w:shd w:fill="auto" w:val="clear"/>
+              </w:rPr>
+            </w:pPr>
+            <w:r>
+              <w:rPr>
+                <w:bCs/>
+                <w:sz w:val="26"/>
+                <w:szCs w:val="26"/>
+                <w:shd w:fill="auto" w:val="clear"/>
+              </w:rPr>
+            </w:r>
           </w:p>
         </w:tc>
         <w:tc>
           <w:tcPr>
-            <w:tcW w:w="303" w:type="dxa"/>
+            <w:tcW w:w="304" w:type="dxa"/>
+            <w:tcBorders/>
           </w:tcPr>
           <w:p>
             <w:pPr>
+              <w:pStyle w:val="Normal"/>
+              <w:widowControl w:val="false"/>
               <w:jc w:val="center"/>
               <w:rPr>
-                <w:bCs/>
-                <w:sz w:val="26"/>
-                <w:szCs w:val="26"/>
-                <w:highlight w:val="yellow"/>
-              </w:rPr>
-            </w:pPr>
-            <w:r>
-              <w:rPr>
-                <w:bCs/>
-                <w:sz w:val="26"/>
-                <w:szCs w:val="26"/>
-                <w:highlight w:val="yellow"/>
+                <w:highlight w:val="none"/>
+                <w:shd w:fill="auto" w:val="clear"/>
+              </w:rPr>
+            </w:pPr>
+            <w:r>
+              <w:rPr>
+                <w:bCs/>
+                <w:sz w:val="26"/>
+                <w:szCs w:val="26"/>
+                <w:shd w:fill="auto" w:val="clear"/>
               </w:rPr>
               <w:t>)</w:t>
             </w:r>
@@ -189,42 +213,57 @@
         </w:tc>
         <w:tc>
           <w:tcPr>
-            <w:tcW w:w="4140" w:type="dxa"/>
+            <w:tcW w:w="4067" w:type="dxa"/>
+            <w:tcBorders/>
           </w:tcPr>
           <w:p>
             <w:pPr>
+              <w:pStyle w:val="Normal"/>
+              <w:widowControl w:val="false"/>
               <w:jc w:val="center"/>
               <w:rPr>
                 <w:b/>
-                <w:sz w:val="26"/>
-                <w:szCs w:val="26"/>
-                <w:highlight w:val="yellow"/>
-              </w:rPr>
-            </w:pPr>
+                <w:b/>
+                <w:sz w:val="26"/>
+                <w:szCs w:val="26"/>
+                <w:highlight w:val="none"/>
+                <w:shd w:fill="auto" w:val="clear"/>
+              </w:rPr>
+            </w:pPr>
+            <w:r>
+              <w:rPr>
+                <w:b/>
+                <w:sz w:val="26"/>
+                <w:szCs w:val="26"/>
+                <w:shd w:fill="auto" w:val="clear"/>
+              </w:rPr>
+            </w:r>
           </w:p>
         </w:tc>
       </w:tr>
       <w:tr>
+        <w:trPr/>
         <w:tc>
           <w:tcPr>
-            <w:tcW w:w="5058" w:type="dxa"/>
+            <w:tcW w:w="4988" w:type="dxa"/>
             <w:gridSpan w:val="2"/>
+            <w:tcBorders/>
           </w:tcPr>
           <w:p>
             <w:pPr>
-              <w:rPr>
-                <w:bCs/>
-                <w:sz w:val="26"/>
-                <w:szCs w:val="26"/>
-                <w:highlight w:val="yellow"/>
-              </w:rPr>
-            </w:pPr>
-            <w:r>
-              <w:rPr>
-                <w:bCs/>
-                <w:sz w:val="26"/>
-                <w:szCs w:val="26"/>
-                <w:highlight w:val="yellow"/>
+              <w:pStyle w:val="Normal"/>
+              <w:widowControl w:val="false"/>
+              <w:rPr>
+                <w:highlight w:val="none"/>
+                <w:shd w:fill="auto" w:val="clear"/>
+              </w:rPr>
+            </w:pPr>
+            <w:r>
+              <w:rPr>
+                <w:bCs/>
+                <w:sz w:val="26"/>
+                <w:szCs w:val="26"/>
+                <w:shd w:fill="auto" w:val="clear"/>
               </w:rPr>
               <w:t>{{ petitioner.name.full() }}</w:t>
             </w:r>
@@ -232,24 +271,25 @@
         </w:tc>
         <w:tc>
           <w:tcPr>
-            <w:tcW w:w="303" w:type="dxa"/>
+            <w:tcW w:w="304" w:type="dxa"/>
+            <w:tcBorders/>
           </w:tcPr>
           <w:p>
             <w:pPr>
+              <w:pStyle w:val="Normal"/>
+              <w:widowControl w:val="false"/>
               <w:jc w:val="center"/>
               <w:rPr>
-                <w:bCs/>
-                <w:sz w:val="26"/>
-                <w:szCs w:val="26"/>
-                <w:highlight w:val="yellow"/>
-              </w:rPr>
-            </w:pPr>
-            <w:r>
-              <w:rPr>
-                <w:bCs/>
-                <w:sz w:val="26"/>
-                <w:szCs w:val="26"/>
-                <w:highlight w:val="yellow"/>
+                <w:highlight w:val="none"/>
+                <w:shd w:fill="auto" w:val="clear"/>
+              </w:rPr>
+            </w:pPr>
+            <w:r>
+              <w:rPr>
+                <w:bCs/>
+                <w:sz w:val="26"/>
+                <w:szCs w:val="26"/>
+                <w:shd w:fill="auto" w:val="clear"/>
               </w:rPr>
               <w:t>)</w:t>
             </w:r>
@@ -257,56 +297,82 @@
         </w:tc>
         <w:tc>
           <w:tcPr>
-            <w:tcW w:w="4140" w:type="dxa"/>
+            <w:tcW w:w="4067" w:type="dxa"/>
+            <w:tcBorders/>
           </w:tcPr>
           <w:p>
             <w:pPr>
-              <w:rPr>
-                <w:bCs/>
-                <w:sz w:val="26"/>
-                <w:szCs w:val="26"/>
-                <w:highlight w:val="yellow"/>
-              </w:rPr>
-            </w:pPr>
+              <w:pStyle w:val="Normal"/>
+              <w:widowControl w:val="false"/>
+              <w:rPr>
+                <w:bCs/>
+                <w:sz w:val="26"/>
+                <w:szCs w:val="26"/>
+                <w:highlight w:val="none"/>
+                <w:shd w:fill="auto" w:val="clear"/>
+              </w:rPr>
+            </w:pPr>
+            <w:r>
+              <w:rPr>
+                <w:bCs/>
+                <w:sz w:val="26"/>
+                <w:szCs w:val="26"/>
+                <w:shd w:fill="auto" w:val="clear"/>
+              </w:rPr>
+            </w:r>
           </w:p>
         </w:tc>
       </w:tr>
       <w:tr>
+        <w:trPr/>
         <w:tc>
           <w:tcPr>
-            <w:tcW w:w="2529" w:type="dxa"/>
+            <w:tcW w:w="2476" w:type="dxa"/>
+            <w:tcBorders/>
           </w:tcPr>
           <w:p>
             <w:pPr>
+              <w:pStyle w:val="Normal"/>
+              <w:widowControl w:val="false"/>
               <w:jc w:val="center"/>
               <w:rPr>
                 <w:bCs/>
                 <w:sz w:val="26"/>
                 <w:szCs w:val="26"/>
-                <w:highlight w:val="yellow"/>
-              </w:rPr>
-            </w:pPr>
+                <w:highlight w:val="none"/>
+                <w:shd w:fill="auto" w:val="clear"/>
+              </w:rPr>
+            </w:pPr>
+            <w:r>
+              <w:rPr>
+                <w:bCs/>
+                <w:sz w:val="26"/>
+                <w:szCs w:val="26"/>
+                <w:shd w:fill="auto" w:val="clear"/>
+              </w:rPr>
+            </w:r>
           </w:p>
         </w:tc>
         <w:tc>
           <w:tcPr>
-            <w:tcW w:w="2529" w:type="dxa"/>
+            <w:tcW w:w="2512" w:type="dxa"/>
+            <w:tcBorders/>
           </w:tcPr>
           <w:p>
             <w:pPr>
-              <w:rPr>
-                <w:bCs/>
-                <w:sz w:val="26"/>
-                <w:szCs w:val="26"/>
-                <w:highlight w:val="yellow"/>
-              </w:rPr>
-            </w:pPr>
-            <w:r>
-              <w:rPr>
-                <w:bCs/>
-                <w:sz w:val="26"/>
-                <w:szCs w:val="26"/>
-                <w:highlight w:val="yellow"/>
+              <w:pStyle w:val="Normal"/>
+              <w:widowControl w:val="false"/>
+              <w:rPr>
+                <w:highlight w:val="none"/>
+                <w:shd w:fill="auto" w:val="clear"/>
+              </w:rPr>
+            </w:pPr>
+            <w:r>
+              <w:rPr>
+                <w:bCs/>
+                <w:sz w:val="26"/>
+                <w:szCs w:val="26"/>
+                <w:shd w:fill="auto" w:val="clear"/>
               </w:rPr>
               <w:t>Petitioner,</w:t>
             </w:r>
@@ -314,24 +380,25 @@
         </w:tc>
         <w:tc>
           <w:tcPr>
-            <w:tcW w:w="303" w:type="dxa"/>
+            <w:tcW w:w="304" w:type="dxa"/>
+            <w:tcBorders/>
           </w:tcPr>
           <w:p>
             <w:pPr>
+              <w:pStyle w:val="Normal"/>
+              <w:widowControl w:val="false"/>
               <w:jc w:val="center"/>
               <w:rPr>
-                <w:bCs/>
-                <w:sz w:val="26"/>
-                <w:szCs w:val="26"/>
-                <w:highlight w:val="yellow"/>
-              </w:rPr>
-            </w:pPr>
-            <w:r>
-              <w:rPr>
-                <w:bCs/>
-                <w:sz w:val="26"/>
-                <w:szCs w:val="26"/>
-                <w:highlight w:val="yellow"/>
+                <w:highlight w:val="none"/>
+                <w:shd w:fill="auto" w:val="clear"/>
+              </w:rPr>
+            </w:pPr>
+            <w:r>
+              <w:rPr>
+                <w:bCs/>
+                <w:sz w:val="26"/>
+                <w:szCs w:val="26"/>
+                <w:shd w:fill="auto" w:val="clear"/>
               </w:rPr>
               <w:t>)</w:t>
             </w:r>
@@ -339,145 +406,171 @@
         </w:tc>
         <w:tc>
           <w:tcPr>
-            <w:tcW w:w="4140" w:type="dxa"/>
+            <w:tcW w:w="4067" w:type="dxa"/>
+            <w:tcBorders/>
           </w:tcPr>
           <w:p>
             <w:pPr>
+              <w:pStyle w:val="Normal"/>
+              <w:widowControl w:val="false"/>
               <w:jc w:val="both"/>
               <w:rPr>
-                <w:bCs/>
-                <w:sz w:val="26"/>
-                <w:szCs w:val="26"/>
-                <w:highlight w:val="yellow"/>
-              </w:rPr>
-            </w:pPr>
-            <w:r>
-              <w:rPr>
-                <w:bCs/>
-                <w:sz w:val="26"/>
-                <w:szCs w:val="26"/>
-                <w:highlight w:val="yellow"/>
-              </w:rPr>
-              <w:t xml:space="preserve">Case No. </w:t>
-            </w:r>
-            <w:r>
-              <w:rPr>
-                <w:bCs/>
-                <w:sz w:val="26"/>
-                <w:szCs w:val="26"/>
-                <w:highlight w:val="yellow"/>
-              </w:rPr>
-              <w:t>{{ case.number }}</w:t>
+                <w:highlight w:val="none"/>
+                <w:shd w:fill="auto" w:val="clear"/>
+              </w:rPr>
+            </w:pPr>
+            <w:r>
+              <w:rPr>
+                <w:bCs/>
+                <w:sz w:val="26"/>
+                <w:szCs w:val="26"/>
+                <w:shd w:fill="auto" w:val="clear"/>
+              </w:rPr>
+              <w:t>Case No. {{ case.number }}</w:t>
             </w:r>
           </w:p>
         </w:tc>
       </w:tr>
       <w:tr>
+        <w:trPr/>
         <w:tc>
           <w:tcPr>
-            <w:tcW w:w="5058" w:type="dxa"/>
+            <w:tcW w:w="4988" w:type="dxa"/>
             <w:gridSpan w:val="2"/>
+            <w:tcBorders/>
           </w:tcPr>
           <w:p>
             <w:pPr>
-              <w:rPr>
-                <w:bCs/>
-                <w:sz w:val="26"/>
-                <w:szCs w:val="26"/>
-                <w:highlight w:val="yellow"/>
-              </w:rPr>
-            </w:pPr>
-          </w:p>
-          <w:p>
-            <w:pPr>
-              <w:rPr>
-                <w:bCs/>
-                <w:sz w:val="26"/>
-                <w:szCs w:val="26"/>
-                <w:highlight w:val="yellow"/>
-              </w:rPr>
-            </w:pPr>
-            <w:r>
-              <w:rPr>
-                <w:bCs/>
-                <w:sz w:val="26"/>
-                <w:szCs w:val="26"/>
-                <w:highlight w:val="yellow"/>
-              </w:rPr>
-              <w:t xml:space="preserve">                 vs. </w:t>
-            </w:r>
-          </w:p>
-          <w:p>
-            <w:pPr>
-              <w:rPr>
-                <w:bCs/>
-                <w:sz w:val="26"/>
-                <w:szCs w:val="26"/>
-                <w:highlight w:val="yellow"/>
-              </w:rPr>
-            </w:pPr>
+              <w:pStyle w:val="Normal"/>
+              <w:widowControl w:val="false"/>
+              <w:rPr>
+                <w:bCs/>
+                <w:sz w:val="26"/>
+                <w:szCs w:val="26"/>
+                <w:highlight w:val="none"/>
+                <w:shd w:fill="auto" w:val="clear"/>
+              </w:rPr>
+            </w:pPr>
+            <w:r>
+              <w:rPr>
+                <w:bCs/>
+                <w:sz w:val="26"/>
+                <w:szCs w:val="26"/>
+                <w:shd w:fill="auto" w:val="clear"/>
+              </w:rPr>
+            </w:r>
+          </w:p>
+          <w:p>
+            <w:pPr>
+              <w:pStyle w:val="Normal"/>
+              <w:widowControl w:val="false"/>
+              <w:rPr>
+                <w:highlight w:val="none"/>
+                <w:shd w:fill="auto" w:val="clear"/>
+              </w:rPr>
+            </w:pPr>
+            <w:r>
+              <w:rPr>
+                <w:bCs/>
+                <w:sz w:val="26"/>
+                <w:szCs w:val="26"/>
+                <w:shd w:fill="auto" w:val="clear"/>
+              </w:rPr>
+              <w:t xml:space="preserve">                 </w:t>
+            </w:r>
+            <w:r>
+              <w:rPr>
+                <w:bCs/>
+                <w:sz w:val="26"/>
+                <w:szCs w:val="26"/>
+                <w:shd w:fill="auto" w:val="clear"/>
+              </w:rPr>
+              <w:t xml:space="preserve">vs. </w:t>
+            </w:r>
+          </w:p>
+          <w:p>
+            <w:pPr>
+              <w:pStyle w:val="Normal"/>
+              <w:widowControl w:val="false"/>
+              <w:rPr>
+                <w:bCs/>
+                <w:sz w:val="26"/>
+                <w:szCs w:val="26"/>
+                <w:highlight w:val="none"/>
+                <w:shd w:fill="auto" w:val="clear"/>
+              </w:rPr>
+            </w:pPr>
+            <w:r>
+              <w:rPr>
+                <w:bCs/>
+                <w:sz w:val="26"/>
+                <w:szCs w:val="26"/>
+                <w:shd w:fill="auto" w:val="clear"/>
+              </w:rPr>
+            </w:r>
           </w:p>
         </w:tc>
         <w:tc>
           <w:tcPr>
-            <w:tcW w:w="303" w:type="dxa"/>
+            <w:tcW w:w="304" w:type="dxa"/>
+            <w:tcBorders/>
           </w:tcPr>
           <w:p>
             <w:pPr>
+              <w:pStyle w:val="Normal"/>
+              <w:widowControl w:val="false"/>
               <w:jc w:val="center"/>
               <w:rPr>
-                <w:bCs/>
-                <w:sz w:val="26"/>
-                <w:szCs w:val="26"/>
-                <w:highlight w:val="yellow"/>
-              </w:rPr>
-            </w:pPr>
-            <w:r>
-              <w:rPr>
-                <w:bCs/>
-                <w:sz w:val="26"/>
-                <w:szCs w:val="26"/>
-                <w:highlight w:val="yellow"/>
+                <w:highlight w:val="none"/>
+                <w:shd w:fill="auto" w:val="clear"/>
+              </w:rPr>
+            </w:pPr>
+            <w:r>
+              <w:rPr>
+                <w:bCs/>
+                <w:sz w:val="26"/>
+                <w:szCs w:val="26"/>
+                <w:shd w:fill="auto" w:val="clear"/>
               </w:rPr>
               <w:t>)</w:t>
             </w:r>
           </w:p>
           <w:p>
             <w:pPr>
+              <w:pStyle w:val="Normal"/>
+              <w:widowControl w:val="false"/>
               <w:jc w:val="center"/>
               <w:rPr>
-                <w:bCs/>
-                <w:sz w:val="26"/>
-                <w:szCs w:val="26"/>
-                <w:highlight w:val="yellow"/>
-              </w:rPr>
-            </w:pPr>
-            <w:r>
-              <w:rPr>
-                <w:bCs/>
-                <w:sz w:val="26"/>
-                <w:szCs w:val="26"/>
-                <w:highlight w:val="yellow"/>
+                <w:highlight w:val="none"/>
+                <w:shd w:fill="auto" w:val="clear"/>
+              </w:rPr>
+            </w:pPr>
+            <w:r>
+              <w:rPr>
+                <w:bCs/>
+                <w:sz w:val="26"/>
+                <w:szCs w:val="26"/>
+                <w:shd w:fill="auto" w:val="clear"/>
               </w:rPr>
               <w:t>)</w:t>
             </w:r>
           </w:p>
           <w:p>
             <w:pPr>
+              <w:pStyle w:val="Normal"/>
+              <w:widowControl w:val="false"/>
               <w:jc w:val="center"/>
               <w:rPr>
-                <w:bCs/>
-                <w:sz w:val="26"/>
-                <w:szCs w:val="26"/>
-                <w:highlight w:val="yellow"/>
-              </w:rPr>
-            </w:pPr>
-            <w:r>
-              <w:rPr>
-                <w:bCs/>
-                <w:sz w:val="26"/>
-                <w:szCs w:val="26"/>
-                <w:highlight w:val="yellow"/>
+                <w:highlight w:val="none"/>
+                <w:shd w:fill="auto" w:val="clear"/>
+              </w:rPr>
+            </w:pPr>
+            <w:r>
+              <w:rPr>
+                <w:bCs/>
+                <w:sz w:val="26"/>
+                <w:szCs w:val="26"/>
+                <w:shd w:fill="auto" w:val="clear"/>
               </w:rPr>
               <w:t>)</w:t>
             </w:r>
@@ -485,42 +578,56 @@
         </w:tc>
         <w:tc>
           <w:tcPr>
-            <w:tcW w:w="4140" w:type="dxa"/>
+            <w:tcW w:w="4067" w:type="dxa"/>
+            <w:tcBorders/>
           </w:tcPr>
           <w:p>
             <w:pPr>
+              <w:pStyle w:val="Normal"/>
+              <w:widowControl w:val="false"/>
               <w:jc w:val="center"/>
               <w:rPr>
                 <w:bCs/>
                 <w:sz w:val="26"/>
                 <w:szCs w:val="26"/>
-                <w:highlight w:val="yellow"/>
-              </w:rPr>
-            </w:pPr>
+                <w:highlight w:val="none"/>
+                <w:shd w:fill="auto" w:val="clear"/>
+              </w:rPr>
+            </w:pPr>
+            <w:r>
+              <w:rPr>
+                <w:bCs/>
+                <w:sz w:val="26"/>
+                <w:szCs w:val="26"/>
+                <w:shd w:fill="auto" w:val="clear"/>
+              </w:rPr>
+            </w:r>
           </w:p>
         </w:tc>
       </w:tr>
       <w:tr>
+        <w:trPr/>
         <w:tc>
           <w:tcPr>
-            <w:tcW w:w="5058" w:type="dxa"/>
+            <w:tcW w:w="4988" w:type="dxa"/>
             <w:gridSpan w:val="2"/>
+            <w:tcBorders/>
           </w:tcPr>
           <w:p>
             <w:pPr>
-              <w:rPr>
-                <w:bCs/>
-                <w:sz w:val="26"/>
-                <w:szCs w:val="26"/>
-                <w:highlight w:val="yellow"/>
-              </w:rPr>
-            </w:pPr>
-            <w:r>
-              <w:rPr>
-                <w:bCs/>
-                <w:sz w:val="26"/>
-                <w:szCs w:val="26"/>
-                <w:highlight w:val="yellow"/>
+              <w:pStyle w:val="Normal"/>
+              <w:widowControl w:val="false"/>
+              <w:rPr>
+                <w:highlight w:val="none"/>
+                <w:shd w:fill="auto" w:val="clear"/>
+              </w:rPr>
+            </w:pPr>
+            <w:r>
+              <w:rPr>
+                <w:bCs/>
+                <w:sz w:val="26"/>
+                <w:szCs w:val="26"/>
+                <w:shd w:fill="auto" w:val="clear"/>
               </w:rPr>
               <w:t>{{ respondent.name.full() }}</w:t>
             </w:r>
@@ -528,44 +635,45 @@
         </w:tc>
         <w:tc>
           <w:tcPr>
-            <w:tcW w:w="303" w:type="dxa"/>
+            <w:tcW w:w="304" w:type="dxa"/>
+            <w:tcBorders/>
           </w:tcPr>
           <w:p>
             <w:pPr>
+              <w:pStyle w:val="Normal"/>
+              <w:widowControl w:val="false"/>
               <w:jc w:val="center"/>
               <w:rPr>
-                <w:bCs/>
-                <w:sz w:val="26"/>
-                <w:szCs w:val="26"/>
-                <w:highlight w:val="yellow"/>
-              </w:rPr>
-            </w:pPr>
-            <w:r>
-              <w:rPr>
-                <w:bCs/>
-                <w:sz w:val="26"/>
-                <w:szCs w:val="26"/>
-                <w:highlight w:val="yellow"/>
+                <w:highlight w:val="none"/>
+                <w:shd w:fill="auto" w:val="clear"/>
+              </w:rPr>
+            </w:pPr>
+            <w:r>
+              <w:rPr>
+                <w:bCs/>
+                <w:sz w:val="26"/>
+                <w:szCs w:val="26"/>
+                <w:shd w:fill="auto" w:val="clear"/>
               </w:rPr>
               <w:t>)</w:t>
             </w:r>
           </w:p>
           <w:p>
             <w:pPr>
+              <w:pStyle w:val="Normal"/>
+              <w:widowControl w:val="false"/>
               <w:jc w:val="center"/>
               <w:rPr>
-                <w:bCs/>
-                <w:sz w:val="26"/>
-                <w:szCs w:val="26"/>
-                <w:highlight w:val="yellow"/>
-              </w:rPr>
-            </w:pPr>
-            <w:r>
-              <w:rPr>
-                <w:bCs/>
-                <w:sz w:val="26"/>
-                <w:szCs w:val="26"/>
-                <w:highlight w:val="yellow"/>
+                <w:highlight w:val="none"/>
+                <w:shd w:fill="auto" w:val="clear"/>
+              </w:rPr>
+            </w:pPr>
+            <w:r>
+              <w:rPr>
+                <w:bCs/>
+                <w:sz w:val="26"/>
+                <w:szCs w:val="26"/>
+                <w:shd w:fill="auto" w:val="clear"/>
               </w:rPr>
               <w:t>)</w:t>
             </w:r>
@@ -573,74 +681,80 @@
         </w:tc>
         <w:tc>
           <w:tcPr>
-            <w:tcW w:w="4140" w:type="dxa"/>
+            <w:tcW w:w="4067" w:type="dxa"/>
+            <w:tcBorders/>
           </w:tcPr>
           <w:p>
             <w:pPr>
-              <w:rPr>
-                <w:bCs/>
-                <w:sz w:val="26"/>
-                <w:szCs w:val="26"/>
-                <w:highlight w:val="yellow"/>
-              </w:rPr>
-            </w:pPr>
-            <w:r>
-              <w:rPr>
-                <w:bCs/>
-                <w:sz w:val="26"/>
-                <w:szCs w:val="26"/>
-                <w:highlight w:val="yellow"/>
-              </w:rPr>
-              <w:t>Division</w:t>
-            </w:r>
-            <w:r>
-              <w:rPr>
-                <w:bCs/>
-                <w:sz w:val="26"/>
-                <w:szCs w:val="26"/>
-                <w:highlight w:val="yellow"/>
-              </w:rPr>
-              <w:t xml:space="preserve"> {{ case.division }}</w:t>
+              <w:pStyle w:val="Normal"/>
+              <w:widowControl w:val="false"/>
+              <w:rPr>
+                <w:highlight w:val="none"/>
+                <w:shd w:fill="auto" w:val="clear"/>
+              </w:rPr>
+            </w:pPr>
+            <w:r>
+              <w:rPr>
+                <w:bCs/>
+                <w:sz w:val="26"/>
+                <w:szCs w:val="26"/>
+                <w:shd w:fill="auto" w:val="clear"/>
+              </w:rPr>
+              <w:t>Division {{ case.division }}</w:t>
             </w:r>
           </w:p>
         </w:tc>
       </w:tr>
       <w:tr>
+        <w:trPr/>
         <w:tc>
           <w:tcPr>
-            <w:tcW w:w="2529" w:type="dxa"/>
+            <w:tcW w:w="2476" w:type="dxa"/>
+            <w:tcBorders/>
           </w:tcPr>
           <w:p>
             <w:pPr>
+              <w:pStyle w:val="Normal"/>
+              <w:widowControl w:val="false"/>
               <w:jc w:val="center"/>
               <w:rPr>
                 <w:bCs/>
                 <w:sz w:val="26"/>
                 <w:szCs w:val="26"/>
-                <w:highlight w:val="yellow"/>
-              </w:rPr>
-            </w:pPr>
+                <w:highlight w:val="none"/>
+                <w:shd w:fill="auto" w:val="clear"/>
+              </w:rPr>
+            </w:pPr>
+            <w:r>
+              <w:rPr>
+                <w:bCs/>
+                <w:sz w:val="26"/>
+                <w:szCs w:val="26"/>
+                <w:shd w:fill="auto" w:val="clear"/>
+              </w:rPr>
+            </w:r>
           </w:p>
         </w:tc>
         <w:tc>
           <w:tcPr>
-            <w:tcW w:w="2529" w:type="dxa"/>
+            <w:tcW w:w="2512" w:type="dxa"/>
+            <w:tcBorders/>
           </w:tcPr>
           <w:p>
             <w:pPr>
-              <w:rPr>
-                <w:bCs/>
-                <w:sz w:val="26"/>
-                <w:szCs w:val="26"/>
-                <w:highlight w:val="yellow"/>
-              </w:rPr>
-            </w:pPr>
-            <w:r>
-              <w:rPr>
-                <w:bCs/>
-                <w:sz w:val="26"/>
-                <w:szCs w:val="26"/>
-                <w:highlight w:val="yellow"/>
+              <w:pStyle w:val="Normal"/>
+              <w:widowControl w:val="false"/>
+              <w:rPr>
+                <w:highlight w:val="none"/>
+                <w:shd w:fill="auto" w:val="clear"/>
+              </w:rPr>
+            </w:pPr>
+            <w:r>
+              <w:rPr>
+                <w:bCs/>
+                <w:sz w:val="26"/>
+                <w:szCs w:val="26"/>
+                <w:shd w:fill="auto" w:val="clear"/>
               </w:rPr>
               <w:t>Respondent.</w:t>
             </w:r>
@@ -648,23 +762,25 @@
         </w:tc>
         <w:tc>
           <w:tcPr>
-            <w:tcW w:w="303" w:type="dxa"/>
+            <w:tcW w:w="304" w:type="dxa"/>
+            <w:tcBorders/>
           </w:tcPr>
           <w:p>
             <w:pPr>
+              <w:pStyle w:val="Normal"/>
+              <w:widowControl w:val="false"/>
               <w:jc w:val="center"/>
               <w:rPr>
-                <w:bCs/>
-                <w:sz w:val="26"/>
-                <w:szCs w:val="26"/>
-              </w:rPr>
-            </w:pPr>
-            <w:r>
-              <w:rPr>
-                <w:bCs/>
-                <w:sz w:val="26"/>
-                <w:szCs w:val="26"/>
-                <w:highlight w:val="yellow"/>
+                <w:highlight w:val="none"/>
+                <w:shd w:fill="auto" w:val="clear"/>
+              </w:rPr>
+            </w:pPr>
+            <w:r>
+              <w:rPr>
+                <w:bCs/>
+                <w:sz w:val="26"/>
+                <w:szCs w:val="26"/>
+                <w:shd w:fill="auto" w:val="clear"/>
               </w:rPr>
               <w:t>)</w:t>
             </w:r>
@@ -672,115 +788,125 @@
         </w:tc>
         <w:tc>
           <w:tcPr>
-            <w:tcW w:w="4140" w:type="dxa"/>
+            <w:tcW w:w="4067" w:type="dxa"/>
+            <w:tcBorders/>
           </w:tcPr>
           <w:p>
             <w:pPr>
+              <w:pStyle w:val="Normal"/>
+              <w:widowControl w:val="false"/>
               <w:jc w:val="center"/>
               <w:rPr>
                 <w:b/>
-                <w:sz w:val="26"/>
-                <w:szCs w:val="26"/>
-              </w:rPr>
-            </w:pPr>
+                <w:b/>
+                <w:sz w:val="26"/>
+                <w:szCs w:val="26"/>
+                <w:highlight w:val="none"/>
+                <w:shd w:fill="auto" w:val="clear"/>
+              </w:rPr>
+            </w:pPr>
+            <w:r>
+              <w:rPr>
+                <w:b/>
+                <w:sz w:val="26"/>
+                <w:szCs w:val="26"/>
+                <w:shd w:fill="auto" w:val="clear"/>
+              </w:rPr>
+            </w:r>
           </w:p>
         </w:tc>
       </w:tr>
     </w:tbl>
     <w:p>
       <w:pPr>
-        <w:rPr>
-          <w:sz w:val="26"/>
-          <w:szCs w:val="26"/>
-        </w:rPr>
-      </w:pPr>
-    </w:p>
-    <w:p>
-      <w:pPr>
-        <w:spacing w:after="240"/>
+        <w:pStyle w:val="Normal"/>
+        <w:rPr>
+          <w:sz w:val="26"/>
+          <w:szCs w:val="26"/>
+          <w:highlight w:val="none"/>
+          <w:shd w:fill="auto" w:val="clear"/>
+        </w:rPr>
+      </w:pPr>
+      <w:r>
+        <w:rPr>
+          <w:sz w:val="26"/>
+          <w:szCs w:val="26"/>
+          <w:shd w:fill="auto" w:val="clear"/>
+        </w:rPr>
+      </w:r>
+    </w:p>
+    <w:p>
+      <w:pPr>
+        <w:pStyle w:val="Normal"/>
+        <w:spacing w:before="0" w:after="240"/>
         <w:jc w:val="center"/>
         <w:rPr>
+          <w:highlight w:val="none"/>
+          <w:shd w:fill="auto" w:val="clear"/>
+        </w:rPr>
+      </w:pPr>
+      <w:r>
+        <w:rPr>
           <w:b/>
           <w:sz w:val="26"/>
           <w:szCs w:val="26"/>
           <w:u w:val="single"/>
-        </w:rPr>
-      </w:pPr>
-      <w:r>
-        <w:rPr>
-          <w:b/>
+          <w:shd w:fill="auto" w:val="clear"/>
+        </w:rPr>
+        <w:t>NOTICE AND ACKNOWLEDGMENT FOR SERVICE BY MAIL</w:t>
+      </w:r>
+    </w:p>
+    <w:p>
+      <w:pPr>
+        <w:pStyle w:val="Normal"/>
+        <w:spacing w:before="0" w:after="240"/>
+        <w:rPr>
+          <w:highlight w:val="none"/>
+          <w:shd w:fill="auto" w:val="clear"/>
+        </w:rPr>
+      </w:pPr>
+      <w:r>
+        <w:rPr>
+          <w:sz w:val="26"/>
+          <w:szCs w:val="26"/>
+          <w:shd w:fill="auto" w:val="clear"/>
+        </w:rPr>
+        <w:t xml:space="preserve">TO: </w:t>
+      </w:r>
+      <w:r>
+        <w:rPr>
           <w:sz w:val="26"/>
           <w:szCs w:val="26"/>
           <w:u w:val="single"/>
-        </w:rPr>
-        <w:t>NOTICE AND ACKNOWLEDGMENT FOR SERVICE BY MAIL</w:t>
-      </w:r>
-    </w:p>
-    <w:p>
-      <w:pPr>
-        <w:spacing w:after="240"/>
-        <w:rPr>
-          <w:sz w:val="26"/>
-          <w:szCs w:val="26"/>
-        </w:rPr>
-      </w:pPr>
-      <w:r>
-        <w:rPr>
-          <w:sz w:val="26"/>
-          <w:szCs w:val="26"/>
-          <w:highlight w:val="yellow"/>
-        </w:rPr>
-        <w:t xml:space="preserve">TO: </w:t>
-      </w:r>
-      <w:r>
-        <w:rPr>
-          <w:sz w:val="26"/>
-          <w:szCs w:val="26"/>
-          <w:highlight w:val="yellow"/>
+          <w:shd w:fill="auto" w:val="clear"/>
+        </w:rPr>
+        <w:t>{{ respondent.name.full() | upper }}</w:t>
+      </w:r>
+    </w:p>
+    <w:p>
+      <w:pPr>
+        <w:pStyle w:val="Normal"/>
+        <w:spacing w:lineRule="auto" w:line="360" w:before="0" w:after="240"/>
+        <w:jc w:val="center"/>
+        <w:rPr>
+          <w:sz w:val="26"/>
+          <w:szCs w:val="26"/>
+        </w:rPr>
+      </w:pPr>
+      <w:r>
+        <w:rPr>
+          <w:sz w:val="26"/>
+          <w:szCs w:val="26"/>
+        </w:rPr>
+        <w:t xml:space="preserve">The enclosed Summons and Petition for Dissolution of Marriage are served pursuant to </w:t>
+      </w:r>
+      <w:r>
+        <w:rPr>
+          <w:sz w:val="26"/>
+          <w:szCs w:val="26"/>
           <w:u w:val="single"/>
         </w:rPr>
-        <w:t>{{ respondent.name.full() | upper }}</w:t>
-      </w:r>
-    </w:p>
-    <w:p>
-      <w:pPr>
-        <w:spacing w:after="240" w:line="360" w:lineRule="auto"/>
-        <w:jc w:val="center"/>
-        <w:rPr>
-          <w:sz w:val="26"/>
-          <w:szCs w:val="26"/>
-        </w:rPr>
-      </w:pPr>
-      <w:r>
-        <w:rPr>
-          <w:sz w:val="26"/>
-          <w:szCs w:val="26"/>
-        </w:rPr>
-        <w:t xml:space="preserve">The enclosed Summons and Petition for Dissolution of Marriage are served pursuant to </w:t>
-      </w:r>
-      <w:r>
-        <w:rPr>
-          <w:sz w:val="26"/>
-          <w:szCs w:val="26"/>
-          <w:u w:val="single"/>
-        </w:rPr>
-        <w:t>RSMo</w:t>
-      </w:r>
-      <w:r>
-        <w:rPr>
-          <w:sz w:val="26"/>
-          <w:szCs w:val="26"/>
-          <w:u w:val="single"/>
-        </w:rPr>
-        <w:t xml:space="preserve"> </w:t>
-      </w:r>
-      <w:r>
-        <w:rPr>
-          <w:sz w:val="26"/>
-          <w:szCs w:val="26"/>
-          <w:u w:val="single"/>
-        </w:rPr>
-        <w:t>506.150</w:t>
+        <w:t>RSMo 506.150</w:t>
       </w:r>
       <w:r>
         <w:rPr>
@@ -792,7 +918,8 @@
     </w:p>
     <w:p>
       <w:pPr>
-        <w:spacing w:after="240" w:line="360" w:lineRule="auto"/>
+        <w:pStyle w:val="Normal"/>
+        <w:spacing w:lineRule="auto" w:line="360" w:before="0" w:after="240"/>
         <w:jc w:val="both"/>
         <w:rPr>
           <w:sz w:val="26"/>
@@ -805,68 +932,13 @@
           <w:szCs w:val="26"/>
         </w:rPr>
         <w:tab/>
-        <w:t xml:space="preserve">You </w:t>
-      </w:r>
-      <w:r>
-        <w:rPr>
-          <w:sz w:val="26"/>
-          <w:szCs w:val="26"/>
-        </w:rPr>
-        <w:t>must complete</w:t>
-      </w:r>
-      <w:r>
-        <w:rPr>
-          <w:sz w:val="26"/>
-          <w:szCs w:val="26"/>
-        </w:rPr>
-        <w:t xml:space="preserve"> the acknowledgment part of this form and return one copy of the completed form to the sender within thirty </w:t>
-      </w:r>
-      <w:r>
-        <w:rPr>
-          <w:sz w:val="26"/>
-          <w:szCs w:val="26"/>
-        </w:rPr>
-        <w:t xml:space="preserve">(30) </w:t>
-      </w:r>
-      <w:r>
-        <w:rPr>
-          <w:sz w:val="26"/>
-          <w:szCs w:val="26"/>
-        </w:rPr>
-        <w:t>day</w:t>
-      </w:r>
-      <w:r>
-        <w:rPr>
-          <w:sz w:val="26"/>
-          <w:szCs w:val="26"/>
-        </w:rPr>
-        <w:t xml:space="preserve">s of </w:t>
-      </w:r>
-      <w:r>
-        <w:rPr>
-          <w:sz w:val="26"/>
-          <w:szCs w:val="26"/>
-        </w:rPr>
-        <w:t>__________________</w:t>
-      </w:r>
-      <w:r>
-        <w:rPr>
-          <w:sz w:val="26"/>
-          <w:szCs w:val="26"/>
-        </w:rPr>
-        <w:t>, 20__</w:t>
-      </w:r>
-      <w:r>
-        <w:rPr>
-          <w:sz w:val="26"/>
-          <w:szCs w:val="26"/>
-        </w:rPr>
-        <w:t>.</w:t>
-      </w:r>
-    </w:p>
-    <w:p>
-      <w:pPr>
-        <w:spacing w:after="240" w:line="360" w:lineRule="auto"/>
+        <w:t>You must complete the acknowledgment part of this form and return one copy of the completed form to the sender within thirty (30) days of __________________, 20__.</w:t>
+      </w:r>
+    </w:p>
+    <w:p>
+      <w:pPr>
+        <w:pStyle w:val="Normal"/>
+        <w:spacing w:lineRule="auto" w:line="360" w:before="0" w:after="240"/>
         <w:jc w:val="both"/>
         <w:rPr>
           <w:sz w:val="26"/>
@@ -879,26 +951,13 @@
           <w:szCs w:val="26"/>
         </w:rPr>
         <w:tab/>
-        <w:t>If you do not complete and return the form to the sender within thirty</w:t>
-      </w:r>
-      <w:r>
-        <w:rPr>
-          <w:sz w:val="26"/>
-          <w:szCs w:val="26"/>
-        </w:rPr>
-        <w:t xml:space="preserve"> (30)</w:t>
-      </w:r>
-      <w:r>
-        <w:rPr>
-          <w:sz w:val="26"/>
-          <w:szCs w:val="26"/>
-        </w:rPr>
-        <w:t xml:space="preserve"> days, you may be required to pay any expenses incurred in serving a summons and petition in any other manner permitted by law.</w:t>
-      </w:r>
-    </w:p>
-    <w:p>
-      <w:pPr>
-        <w:spacing w:line="360" w:lineRule="auto"/>
+        <w:t>If you do not complete and return the form to the sender within thirty (30) days, you may be required to pay any expenses incurred in serving a summons and petition in any other manner permitted by law.</w:t>
+      </w:r>
+    </w:p>
+    <w:p>
+      <w:pPr>
+        <w:pStyle w:val="Normal"/>
+        <w:spacing w:lineRule="auto" w:line="360"/>
         <w:jc w:val="both"/>
         <w:rPr>
           <w:sz w:val="26"/>
@@ -911,50 +970,30 @@
           <w:szCs w:val="26"/>
         </w:rPr>
         <w:tab/>
-        <w:t>If you do complete and return this form, you must answer the petition within thirty</w:t>
-      </w:r>
-      <w:r>
-        <w:rPr>
-          <w:sz w:val="26"/>
-          <w:szCs w:val="26"/>
-        </w:rPr>
-        <w:t xml:space="preserve"> (30)</w:t>
-      </w:r>
-      <w:r>
-        <w:rPr>
-          <w:sz w:val="26"/>
-          <w:szCs w:val="26"/>
-        </w:rPr>
-        <w:t xml:space="preserve"> days of the date you sign the acknowledgment below.  If you fail to do so, judgment by default </w:t>
-      </w:r>
-      <w:r>
-        <w:rPr>
-          <w:sz w:val="26"/>
-          <w:szCs w:val="26"/>
-        </w:rPr>
-        <w:t>will</w:t>
-      </w:r>
-      <w:r>
-        <w:rPr>
-          <w:sz w:val="26"/>
-          <w:szCs w:val="26"/>
-        </w:rPr>
-        <w:t xml:space="preserve"> be taken against you for the relief demanded in the petition.</w:t>
-      </w:r>
-    </w:p>
-    <w:p>
-      <w:pPr>
-        <w:spacing w:line="360" w:lineRule="auto"/>
+        <w:t>If you do complete and return this form, you must answer the petition within thirty (30) days of the date you sign the acknowledgment below.  If you fail to do so, judgment by default will be taken against you for the relief demanded in the petition.</w:t>
+      </w:r>
+    </w:p>
+    <w:p>
+      <w:pPr>
+        <w:pStyle w:val="Normal"/>
+        <w:spacing w:lineRule="auto" w:line="360"/>
         <w:jc w:val="both"/>
         <w:rPr>
           <w:sz w:val="26"/>
           <w:szCs w:val="26"/>
         </w:rPr>
       </w:pPr>
-    </w:p>
-    <w:p>
-      <w:pPr>
-        <w:spacing w:line="360" w:lineRule="auto"/>
+      <w:r>
+        <w:rPr>
+          <w:sz w:val="26"/>
+          <w:szCs w:val="26"/>
+        </w:rPr>
+      </w:r>
+    </w:p>
+    <w:p>
+      <w:pPr>
+        <w:pStyle w:val="Normal"/>
+        <w:spacing w:lineRule="auto" w:line="360"/>
         <w:jc w:val="both"/>
         <w:rPr>
           <w:sz w:val="26"/>
@@ -966,35 +1005,29 @@
           <w:sz w:val="26"/>
           <w:szCs w:val="26"/>
         </w:rPr>
-        <w:t xml:space="preserve">THIS NOTICE AND ACKNOWLEDGMENT OF RECEIPT OF SUMMONS AND PETITION WAS MAILED ON </w:t>
-      </w:r>
-      <w:r>
-        <w:rPr>
-          <w:sz w:val="26"/>
-          <w:szCs w:val="26"/>
-        </w:rPr>
-        <w:t>___________________, 20___</w:t>
-      </w:r>
-      <w:r>
-        <w:rPr>
-          <w:sz w:val="26"/>
-          <w:szCs w:val="26"/>
-        </w:rPr>
-        <w:t>.</w:t>
-      </w:r>
-    </w:p>
-    <w:p>
-      <w:pPr>
-        <w:spacing w:line="360" w:lineRule="auto"/>
+        <w:t>THIS NOTICE AND ACKNOWLEDGMENT OF RECEIPT OF SUMMONS AND PETITION WAS MAILED ON ___________________, 20___.</w:t>
+      </w:r>
+    </w:p>
+    <w:p>
+      <w:pPr>
+        <w:pStyle w:val="Normal"/>
+        <w:spacing w:lineRule="auto" w:line="360"/>
         <w:jc w:val="both"/>
         <w:rPr>
           <w:sz w:val="26"/>
           <w:szCs w:val="26"/>
         </w:rPr>
       </w:pPr>
-    </w:p>
-    <w:p>
-      <w:pPr>
+      <w:r>
+        <w:rPr>
+          <w:sz w:val="26"/>
+          <w:szCs w:val="26"/>
+        </w:rPr>
+      </w:r>
+    </w:p>
+    <w:p>
+      <w:pPr>
+        <w:pStyle w:val="Normal"/>
         <w:jc w:val="both"/>
         <w:rPr>
           <w:sz w:val="26"/>
@@ -1011,6 +1044,7 @@
     </w:p>
     <w:p>
       <w:pPr>
+        <w:pStyle w:val="Normal"/>
         <w:jc w:val="both"/>
         <w:rPr>
           <w:sz w:val="26"/>
@@ -1031,17 +1065,19 @@
         </w:rPr>
         <w:t>Clerk</w:t>
       </w:r>
-    </w:p>
-    <w:p>
-      <w:pPr>
-        <w:overflowPunct/>
-        <w:autoSpaceDE/>
-        <w:autoSpaceDN/>
-        <w:adjustRightInd/>
+      <w:r>
+        <w:br w:type="page"/>
+      </w:r>
+    </w:p>
+    <w:p>
+      <w:pPr>
+        <w:pStyle w:val="Normal"/>
+        <w:overflowPunct w:val="false"/>
         <w:jc w:val="center"/>
         <w:textAlignment w:val="auto"/>
         <w:rPr>
           <w:b/>
+          <w:b/>
           <w:sz w:val="26"/>
           <w:szCs w:val="26"/>
           <w:u w:val="single"/>
@@ -1049,27 +1085,21 @@
       </w:pPr>
       <w:r>
         <w:rPr>
-          <w:sz w:val="26"/>
-          <w:szCs w:val="26"/>
-        </w:rPr>
-        <w:br w:type="page"/>
-      </w:r>
-      <w:r>
-        <w:rPr>
           <w:b/>
           <w:sz w:val="26"/>
           <w:szCs w:val="26"/>
           <w:u w:val="single"/>
         </w:rPr>
-        <w:lastRenderedPageBreak/>
         <w:t>ACKNOWLEDGMENT OF RECEIPT OF SUMMONS AND PETITION</w:t>
       </w:r>
     </w:p>
     <w:p>
       <w:pPr>
+        <w:pStyle w:val="Normal"/>
         <w:jc w:val="center"/>
         <w:rPr>
           <w:b/>
+          <w:b/>
           <w:sz w:val="26"/>
           <w:szCs w:val="26"/>
           <w:u w:val="single"/>
@@ -1087,18 +1117,29 @@
     </w:p>
     <w:p>
       <w:pPr>
+        <w:pStyle w:val="Normal"/>
         <w:jc w:val="center"/>
         <w:rPr>
           <w:b/>
+          <w:b/>
           <w:sz w:val="26"/>
           <w:szCs w:val="26"/>
           <w:u w:val="single"/>
         </w:rPr>
       </w:pPr>
-    </w:p>
-    <w:p>
-      <w:pPr>
-        <w:spacing w:line="360" w:lineRule="auto"/>
+      <w:r>
+        <w:rPr>
+          <w:b/>
+          <w:sz w:val="26"/>
+          <w:szCs w:val="26"/>
+          <w:u w:val="single"/>
+        </w:rPr>
+      </w:r>
+    </w:p>
+    <w:p>
+      <w:pPr>
+        <w:pStyle w:val="Normal"/>
+        <w:spacing w:lineRule="auto" w:line="360"/>
         <w:rPr>
           <w:sz w:val="26"/>
           <w:szCs w:val="26"/>
@@ -1114,7 +1155,8 @@
     </w:p>
     <w:p>
       <w:pPr>
-        <w:spacing w:line="480" w:lineRule="auto"/>
+        <w:pStyle w:val="Normal"/>
+        <w:spacing w:lineRule="auto" w:line="480"/>
         <w:rPr>
           <w:sz w:val="26"/>
           <w:szCs w:val="26"/>
@@ -1126,52 +1168,17 @@
           <w:szCs w:val="26"/>
         </w:rPr>
         <w:tab/>
-      </w:r>
-      <w:r>
-        <w:rPr>
-          <w:sz w:val="26"/>
-          <w:szCs w:val="26"/>
-        </w:rPr>
         <w:tab/>
-      </w:r>
-      <w:r>
-        <w:rPr>
-          <w:sz w:val="26"/>
-          <w:szCs w:val="26"/>
-        </w:rPr>
         <w:tab/>
-      </w:r>
-      <w:r>
-        <w:rPr>
-          <w:sz w:val="26"/>
-          <w:szCs w:val="26"/>
-        </w:rPr>
         <w:tab/>
-      </w:r>
-      <w:r>
-        <w:rPr>
-          <w:sz w:val="26"/>
-          <w:szCs w:val="26"/>
-        </w:rPr>
         <w:tab/>
-      </w:r>
-      <w:r>
-        <w:rPr>
-          <w:sz w:val="26"/>
-          <w:szCs w:val="26"/>
-        </w:rPr>
         <w:tab/>
-      </w:r>
-      <w:r>
-        <w:rPr>
-          <w:sz w:val="26"/>
-          <w:szCs w:val="26"/>
-        </w:rPr>
         <w:tab/>
       </w:r>
     </w:p>
     <w:p>
       <w:pPr>
+        <w:pStyle w:val="Normal"/>
         <w:rPr>
           <w:sz w:val="26"/>
           <w:szCs w:val="26"/>
@@ -1184,136 +1191,102 @@
           <w:u w:val="single"/>
         </w:rPr>
         <w:tab/>
-      </w:r>
-      <w:r>
+        <w:tab/>
+        <w:tab/>
+        <w:tab/>
+        <w:tab/>
+      </w:r>
+    </w:p>
+    <w:p>
+      <w:pPr>
+        <w:pStyle w:val="Normal"/>
+        <w:rPr>
+          <w:sz w:val="26"/>
+          <w:szCs w:val="26"/>
+        </w:rPr>
+      </w:pPr>
+      <w:r>
+        <w:rPr>
+          <w:sz w:val="26"/>
+          <w:szCs w:val="26"/>
+        </w:rPr>
+        <w:t>{{ respondent.name.full() | upper }}</w:t>
+      </w:r>
+    </w:p>
+    <w:p>
+      <w:pPr>
+        <w:pStyle w:val="Normal"/>
+        <w:rPr>
+          <w:sz w:val="26"/>
+          <w:szCs w:val="26"/>
+        </w:rPr>
+      </w:pPr>
+      <w:r>
+        <w:rPr>
+          <w:sz w:val="26"/>
+          <w:szCs w:val="26"/>
+        </w:rPr>
+        <w:t>Respondent</w:t>
+      </w:r>
+    </w:p>
+    <w:p>
+      <w:pPr>
+        <w:pStyle w:val="Normal"/>
+        <w:rPr>
+          <w:sz w:val="26"/>
+          <w:szCs w:val="26"/>
+        </w:rPr>
+      </w:pPr>
+      <w:r>
+        <w:rPr>
+          <w:sz w:val="26"/>
+          <w:szCs w:val="26"/>
+        </w:rPr>
+      </w:r>
+    </w:p>
+    <w:p>
+      <w:pPr>
+        <w:pStyle w:val="Normal"/>
         <w:rPr>
           <w:sz w:val="26"/>
           <w:szCs w:val="26"/>
           <w:u w:val="single"/>
         </w:rPr>
+      </w:pPr>
+      <w:r>
+        <w:rPr>
+          <w:sz w:val="26"/>
+          <w:szCs w:val="26"/>
+          <w:u w:val="single"/>
+        </w:rPr>
+      </w:r>
+    </w:p>
+    <w:p>
+      <w:pPr>
+        <w:pStyle w:val="Normal"/>
+        <w:rPr>
+          <w:sz w:val="26"/>
+          <w:szCs w:val="26"/>
+        </w:rPr>
+      </w:pPr>
+      <w:r>
+        <w:rPr>
+          <w:sz w:val="26"/>
+          <w:szCs w:val="26"/>
+          <w:u w:val="single"/>
+        </w:rPr>
         <w:tab/>
-      </w:r>
-      <w:r>
-        <w:rPr>
-          <w:sz w:val="26"/>
-          <w:szCs w:val="26"/>
-          <w:u w:val="single"/>
-        </w:rPr>
         <w:tab/>
-      </w:r>
-      <w:r>
-        <w:rPr>
-          <w:sz w:val="26"/>
-          <w:szCs w:val="26"/>
-          <w:u w:val="single"/>
-        </w:rPr>
         <w:tab/>
-      </w:r>
-      <w:r>
-        <w:rPr>
-          <w:sz w:val="26"/>
-          <w:szCs w:val="26"/>
-          <w:u w:val="single"/>
-        </w:rPr>
         <w:tab/>
-      </w:r>
-    </w:p>
-    <w:p>
-      <w:pPr>
-        <w:rPr>
-          <w:sz w:val="26"/>
-          <w:szCs w:val="26"/>
-        </w:rPr>
-      </w:pPr>
-      <w:r>
-        <w:rPr>
-          <w:sz w:val="26"/>
-          <w:szCs w:val="26"/>
-        </w:rPr>
-        <w:t>{{ respondent.name.full() | upper }}</w:t>
-      </w:r>
-    </w:p>
-    <w:p>
-      <w:pPr>
-        <w:rPr>
-          <w:sz w:val="26"/>
-          <w:szCs w:val="26"/>
-        </w:rPr>
-      </w:pPr>
-      <w:r>
-        <w:rPr>
-          <w:sz w:val="26"/>
-          <w:szCs w:val="26"/>
-        </w:rPr>
-        <w:t>Respondent</w:t>
-      </w:r>
-    </w:p>
-    <w:p>
-      <w:pPr>
-        <w:rPr>
-          <w:sz w:val="26"/>
-          <w:szCs w:val="26"/>
-        </w:rPr>
-      </w:pPr>
-    </w:p>
-    <w:p>
-      <w:pPr>
-        <w:rPr>
-          <w:sz w:val="26"/>
-          <w:szCs w:val="26"/>
-          <w:u w:val="single"/>
-        </w:rPr>
-      </w:pPr>
-    </w:p>
-    <w:p>
-      <w:pPr>
-        <w:rPr>
-          <w:sz w:val="26"/>
-          <w:szCs w:val="26"/>
-        </w:rPr>
-      </w:pPr>
-      <w:r>
-        <w:rPr>
-          <w:sz w:val="26"/>
-          <w:szCs w:val="26"/>
-          <w:u w:val="single"/>
-        </w:rPr>
         <w:tab/>
       </w:r>
-      <w:r>
-        <w:rPr>
-          <w:sz w:val="26"/>
-          <w:szCs w:val="26"/>
-          <w:u w:val="single"/>
-        </w:rPr>
-        <w:tab/>
-      </w:r>
-      <w:r>
-        <w:rPr>
-          <w:sz w:val="26"/>
-          <w:szCs w:val="26"/>
-          <w:u w:val="single"/>
-        </w:rPr>
-        <w:tab/>
-      </w:r>
-      <w:r>
-        <w:rPr>
-          <w:sz w:val="26"/>
-          <w:szCs w:val="26"/>
-          <w:u w:val="single"/>
-        </w:rPr>
-        <w:tab/>
-      </w:r>
-      <w:r>
-        <w:rPr>
-          <w:sz w:val="26"/>
-          <w:szCs w:val="26"/>
-          <w:u w:val="single"/>
-        </w:rPr>
-        <w:tab/>
-      </w:r>
-    </w:p>
-    <w:p>
+    </w:p>
+    <w:p>
+      <w:pPr>
+        <w:pStyle w:val="Normal"/>
+        <w:rPr/>
+      </w:pPr>
       <w:r>
         <w:rPr>
           <w:sz w:val="26"/>
@@ -1322,46 +1295,82 @@
         <w:t>Date Signed</w:t>
       </w:r>
     </w:p>
-    <w:p/>
-    <w:p/>
-    <w:p/>
-    <w:p>
-      <w:pPr>
-        <w:spacing w:line="480" w:lineRule="auto"/>
-      </w:pPr>
+    <w:p>
+      <w:pPr>
+        <w:pStyle w:val="Normal"/>
+        <w:rPr/>
+      </w:pPr>
+      <w:r>
+        <w:rPr/>
+      </w:r>
+    </w:p>
+    <w:p>
+      <w:pPr>
+        <w:pStyle w:val="Normal"/>
+        <w:rPr/>
+      </w:pPr>
+      <w:r>
+        <w:rPr/>
+      </w:r>
+    </w:p>
+    <w:p>
+      <w:pPr>
+        <w:pStyle w:val="Normal"/>
+        <w:rPr/>
+      </w:pPr>
+      <w:r>
+        <w:rPr/>
+      </w:r>
+    </w:p>
+    <w:p>
+      <w:pPr>
+        <w:pStyle w:val="Normal"/>
+        <w:spacing w:lineRule="auto" w:line="480"/>
+        <w:rPr/>
+      </w:pPr>
+      <w:r>
+        <w:rPr/>
+      </w:r>
     </w:p>
     <w:sectPr>
+      <w:type w:val="nextPage"/>
       <w:pgSz w:w="12240" w:h="15840"/>
-      <w:pgMar w:top="1440" w:right="1440" w:bottom="1440" w:left="1440" w:header="720" w:footer="720" w:gutter="0"/>
-      <w:cols w:space="720"/>
-      <w:docGrid w:linePitch="360"/>
+      <w:pgMar w:left="1440" w:right="1440" w:gutter="0" w:header="0" w:top="1440" w:footer="0" w:bottom="1440"/>
+      <w:pgNumType w:fmt="decimal"/>
+      <w:formProt w:val="false"/>
+      <w:textDirection w:val="lrTb"/>
+      <w:docGrid w:type="default" w:linePitch="360" w:charSpace="0"/>
     </w:sectPr>
   </w:body>
 </w:document>
 </file>
 
 <file path=word/styles.xml><?xml version="1.0" encoding="utf-8"?>
-<w:styles xmlns:mc="http://schemas.openxmlformats.org/markup-compatibility/2006" xmlns:r="http://schemas.openxmlformats.org/officeDocument/2006/relationships" xmlns:w="http://schemas.openxmlformats.org/wordprocessingml/2006/main" xmlns:w14="http://schemas.microsoft.com/office/word/2010/wordml" xmlns:w15="http://schemas.microsoft.com/office/word/2012/wordml" xmlns:w16cex="http://schemas.microsoft.com/office/word/2018/wordml/cex" xmlns:w16cid="http://schemas.microsoft.com/office/word/2016/wordml/cid" xmlns:w16="http://schemas.microsoft.com/office/word/2018/wordml" xmlns:w16du="http://schemas.microsoft.com/office/word/2023/wordml/word16du" xmlns:w16sdtdh="http://schemas.microsoft.com/office/word/2020/wordml/sdtdatahash" xmlns:w16sdtfl="http://schemas.microsoft.com/office/word/2024/wordml/sdtformatlock" xmlns:w16se="http://schemas.microsoft.com/office/word/2015/wordml/symex" mc:Ignorable="w14 w15 w16se w16cid w16 w16cex w16sdtdh w16sdtfl w16du">
+<w:styles xmlns:w="http://schemas.openxmlformats.org/wordprocessingml/2006/main" xmlns:w14="http://schemas.microsoft.com/office/word/2010/wordml" xmlns:mc="http://schemas.openxmlformats.org/markup-compatibility/2006" mc:Ignorable="w14">
   <w:docDefaults>
     <w:rPrDefault>
       <w:rPr>
-        <w:rFonts w:ascii="Calibri" w:eastAsia="Calibri" w:hAnsi="Calibri" w:cs="Times New Roman"/>
+        <w:rFonts w:ascii="Calibri" w:hAnsi="Calibri" w:eastAsia="Calibri" w:cs="Times New Roman"/>
         <w:lang w:val="en-US" w:eastAsia="en-US" w:bidi="ar-SA"/>
       </w:rPr>
     </w:rPrDefault>
-    <w:pPrDefault/>
+    <w:pPrDefault>
+      <w:pPr>
+        <w:suppressAutoHyphens w:val="true"/>
+      </w:pPr>
+    </w:pPrDefault>
   </w:docDefaults>
   <w:latentStyles w:defLockedState="0" w:defUIPriority="99" w:defSemiHidden="0" w:defUnhideWhenUsed="0" w:defQFormat="0" w:count="376">
     <w:lsdException w:name="Normal" w:uiPriority="0" w:qFormat="1"/>
     <w:lsdException w:name="heading 1" w:uiPriority="9" w:qFormat="1"/>
-    <w:lsdException w:name="heading 2" w:semiHidden="1" w:uiPriority="9" w:unhideWhenUsed="1" w:qFormat="1"/>
-    <w:lsdException w:name="heading 3" w:semiHidden="1" w:uiPriority="9" w:unhideWhenUsed="1" w:qFormat="1"/>
-    <w:lsdException w:name="heading 4" w:semiHidden="1" w:uiPriority="9" w:unhideWhenUsed="1" w:qFormat="1"/>
-    <w:lsdException w:name="heading 5" w:semiHidden="1" w:uiPriority="9" w:unhideWhenUsed="1" w:qFormat="1"/>
-    <w:lsdException w:name="heading 6" w:semiHidden="1" w:uiPriority="9" w:unhideWhenUsed="1" w:qFormat="1"/>
-    <w:lsdException w:name="heading 7" w:semiHidden="1" w:uiPriority="9" w:unhideWhenUsed="1" w:qFormat="1"/>
-    <w:lsdException w:name="heading 8" w:semiHidden="1" w:uiPriority="9" w:unhideWhenUsed="1" w:qFormat="1"/>
-    <w:lsdException w:name="heading 9" w:semiHidden="1" w:uiPriority="9" w:unhideWhenUsed="1" w:qFormat="1"/>
+    <w:lsdException w:name="heading 2" w:uiPriority="9" w:semiHidden="1" w:unhideWhenUsed="1" w:qFormat="1"/>
+    <w:lsdException w:name="heading 3" w:uiPriority="9" w:semiHidden="1" w:unhideWhenUsed="1" w:qFormat="1"/>
+    <w:lsdException w:name="heading 4" w:uiPriority="9" w:semiHidden="1" w:unhideWhenUsed="1" w:qFormat="1"/>
+    <w:lsdException w:name="heading 5" w:uiPriority="9" w:semiHidden="1" w:unhideWhenUsed="1" w:qFormat="1"/>
+    <w:lsdException w:name="heading 6" w:uiPriority="9" w:semiHidden="1" w:unhideWhenUsed="1" w:qFormat="1"/>
+    <w:lsdException w:name="heading 7" w:uiPriority="9" w:semiHidden="1" w:unhideWhenUsed="1" w:qFormat="1"/>
+    <w:lsdException w:name="heading 8" w:uiPriority="9" w:semiHidden="1" w:unhideWhenUsed="1" w:qFormat="1"/>
+    <w:lsdException w:name="heading 9" w:uiPriority="9" w:semiHidden="1" w:unhideWhenUsed="1" w:qFormat="1"/>
     <w:lsdException w:name="index 1" w:semiHidden="1" w:unhideWhenUsed="1"/>
     <w:lsdException w:name="index 2" w:semiHidden="1" w:unhideWhenUsed="1"/>
     <w:lsdException w:name="index 3" w:semiHidden="1" w:unhideWhenUsed="1"/>
@@ -1371,22 +1380,22 @@
     <w:lsdException w:name="index 7" w:semiHidden="1" w:unhideWhenUsed="1"/>
     <w:lsdException w:name="index 8" w:semiHidden="1" w:unhideWhenUsed="1"/>
     <w:lsdException w:name="index 9" w:semiHidden="1" w:unhideWhenUsed="1"/>
-    <w:lsdException w:name="toc 1" w:semiHidden="1" w:uiPriority="39" w:unhideWhenUsed="1"/>
-    <w:lsdException w:name="toc 2" w:semiHidden="1" w:uiPriority="39" w:unhideWhenUsed="1"/>
-    <w:lsdException w:name="toc 3" w:semiHidden="1" w:uiPriority="39" w:unhideWhenUsed="1"/>
-    <w:lsdException w:name="toc 4" w:semiHidden="1" w:uiPriority="39" w:unhideWhenUsed="1"/>
-    <w:lsdException w:name="toc 5" w:semiHidden="1" w:uiPriority="39" w:unhideWhenUsed="1"/>
-    <w:lsdException w:name="toc 6" w:semiHidden="1" w:uiPriority="39" w:unhideWhenUsed="1"/>
-    <w:lsdException w:name="toc 7" w:semiHidden="1" w:uiPriority="39" w:unhideWhenUsed="1"/>
-    <w:lsdException w:name="toc 8" w:semiHidden="1" w:uiPriority="39" w:unhideWhenUsed="1"/>
-    <w:lsdException w:name="toc 9" w:semiHidden="1" w:uiPriority="39" w:unhideWhenUsed="1"/>
+    <w:lsdException w:name="toc 1" w:uiPriority="39" w:semiHidden="1" w:unhideWhenUsed="1"/>
+    <w:lsdException w:name="toc 2" w:uiPriority="39" w:semiHidden="1" w:unhideWhenUsed="1"/>
+    <w:lsdException w:name="toc 3" w:uiPriority="39" w:semiHidden="1" w:unhideWhenUsed="1"/>
+    <w:lsdException w:name="toc 4" w:uiPriority="39" w:semiHidden="1" w:unhideWhenUsed="1"/>
+    <w:lsdException w:name="toc 5" w:uiPriority="39" w:semiHidden="1" w:unhideWhenUsed="1"/>
+    <w:lsdException w:name="toc 6" w:uiPriority="39" w:semiHidden="1" w:unhideWhenUsed="1"/>
+    <w:lsdException w:name="toc 7" w:uiPriority="39" w:semiHidden="1" w:unhideWhenUsed="1"/>
+    <w:lsdException w:name="toc 8" w:uiPriority="39" w:semiHidden="1" w:unhideWhenUsed="1"/>
+    <w:lsdException w:name="toc 9" w:uiPriority="39" w:semiHidden="1" w:unhideWhenUsed="1"/>
     <w:lsdException w:name="Normal Indent" w:semiHidden="1" w:unhideWhenUsed="1"/>
     <w:lsdException w:name="footnote text" w:semiHidden="1" w:unhideWhenUsed="1"/>
     <w:lsdException w:name="annotation text" w:semiHidden="1" w:unhideWhenUsed="1"/>
     <w:lsdException w:name="header" w:semiHidden="1" w:unhideWhenUsed="1"/>
     <w:lsdException w:name="footer" w:semiHidden="1" w:unhideWhenUsed="1"/>
     <w:lsdException w:name="index heading" w:semiHidden="1" w:unhideWhenUsed="1"/>
-    <w:lsdException w:name="caption" w:semiHidden="1" w:uiPriority="35" w:unhideWhenUsed="1" w:qFormat="1"/>
+    <w:lsdException w:name="caption" w:uiPriority="35" w:semiHidden="1" w:unhideWhenUsed="1" w:qFormat="1"/>
     <w:lsdException w:name="table of figures" w:semiHidden="1" w:unhideWhenUsed="1"/>
     <w:lsdException w:name="envelope address" w:semiHidden="1" w:unhideWhenUsed="1"/>
     <w:lsdException w:name="envelope return" w:semiHidden="1" w:unhideWhenUsed="1"/>
@@ -1417,7 +1426,7 @@
     <w:lsdException w:name="Title" w:uiPriority="10" w:qFormat="1"/>
     <w:lsdException w:name="Closing" w:semiHidden="1" w:unhideWhenUsed="1"/>
     <w:lsdException w:name="Signature" w:semiHidden="1" w:unhideWhenUsed="1"/>
-    <w:lsdException w:name="Default Paragraph Font" w:semiHidden="1" w:uiPriority="1" w:unhideWhenUsed="1"/>
+    <w:lsdException w:name="Default Paragraph Font" w:uiPriority="1" w:semiHidden="1" w:unhideWhenUsed="1"/>
     <w:lsdException w:name="Body Text" w:semiHidden="1" w:unhideWhenUsed="1"/>
     <w:lsdException w:name="Body Text Indent" w:semiHidden="1" w:unhideWhenUsed="1"/>
     <w:lsdException w:name="List Continue" w:semiHidden="1" w:unhideWhenUsed="1"/>
@@ -1617,8 +1626,8 @@
     <w:lsdException w:name="Subtle Reference" w:uiPriority="31" w:qFormat="1"/>
     <w:lsdException w:name="Intense Reference" w:uiPriority="32" w:qFormat="1"/>
     <w:lsdException w:name="Book Title" w:uiPriority="33" w:qFormat="1"/>
-    <w:lsdException w:name="Bibliography" w:semiHidden="1" w:uiPriority="37" w:unhideWhenUsed="1"/>
-    <w:lsdException w:name="TOC Heading" w:semiHidden="1" w:uiPriority="39" w:unhideWhenUsed="1" w:qFormat="1"/>
+    <w:lsdException w:name="Bibliography" w:uiPriority="37" w:semiHidden="1" w:unhideWhenUsed="1"/>
+    <w:lsdException w:name="TOC Heading" w:uiPriority="39" w:semiHidden="1" w:unhideWhenUsed="1" w:qFormat="1"/>
     <w:lsdException w:name="Plain Table 1" w:uiPriority="41"/>
     <w:lsdException w:name="Plain Table 2" w:uiPriority="42"/>
     <w:lsdException w:name="Plain Table 3" w:uiPriority="43"/>
@@ -1729,27 +1738,99 @@
     <w:lsdException w:name="Unresolved Mention" w:semiHidden="1" w:unhideWhenUsed="1"/>
     <w:lsdException w:name="Smart Link" w:semiHidden="1" w:unhideWhenUsed="1"/>
   </w:latentStyles>
-  <w:style w:type="paragraph" w:default="1" w:styleId="Normal">
+  <w:style w:type="paragraph" w:styleId="Normal" w:default="1">
     <w:name w:val="Normal"/>
     <w:qFormat/>
-    <w:rsid w:val="00026EC6"/>
+    <w:rsid w:val="00026ec6"/>
     <w:pPr>
-      <w:overflowPunct w:val="0"/>
-      <w:autoSpaceDE w:val="0"/>
-      <w:autoSpaceDN w:val="0"/>
-      <w:adjustRightInd w:val="0"/>
+      <w:widowControl/>
+      <w:overflowPunct w:val="true"/>
+      <w:bidi w:val="0"/>
+      <w:spacing w:before="0" w:after="0"/>
+      <w:jc w:val="left"/>
       <w:textAlignment w:val="baseline"/>
     </w:pPr>
     <w:rPr>
-      <w:rFonts w:ascii="Times New Roman" w:eastAsia="Times New Roman" w:hAnsi="Times New Roman"/>
+      <w:rFonts w:ascii="Times New Roman" w:hAnsi="Times New Roman" w:eastAsia="Times New Roman" w:cs="Times New Roman"/>
+      <w:color w:val="auto"/>
+      <w:kern w:val="0"/>
       <w:sz w:val="24"/>
+      <w:szCs w:val="20"/>
+      <w:lang w:val="en-US" w:eastAsia="en-US" w:bidi="ar-SA"/>
     </w:rPr>
   </w:style>
-  <w:style w:type="character" w:default="1" w:styleId="DefaultParagraphFont">
+  <w:style w:type="character" w:styleId="DefaultParagraphFont" w:default="1">
     <w:name w:val="Default Paragraph Font"/>
     <w:uiPriority w:val="1"/>
     <w:semiHidden/>
     <w:unhideWhenUsed/>
+    <w:qFormat/>
+    <w:rPr/>
+  </w:style>
+  <w:style w:type="paragraph" w:styleId="Heading">
+    <w:name w:val="Heading"/>
+    <w:basedOn w:val="Normal"/>
+    <w:next w:val="TextBody"/>
+    <w:qFormat/>
+    <w:pPr>
+      <w:keepNext w:val="true"/>
+      <w:spacing w:before="240" w:after="120"/>
+    </w:pPr>
+    <w:rPr>
+      <w:rFonts w:ascii="Liberation Sans" w:hAnsi="Liberation Sans" w:eastAsia="Noto Sans CJK SC" w:cs="Lohit Devanagari"/>
+      <w:sz w:val="28"/>
+      <w:szCs w:val="28"/>
+    </w:rPr>
+  </w:style>
+  <w:style w:type="paragraph" w:styleId="TextBody">
+    <w:name w:val="Body Text"/>
+    <w:basedOn w:val="Normal"/>
+    <w:pPr>
+      <w:spacing w:lineRule="auto" w:line="276" w:before="0" w:after="140"/>
+    </w:pPr>
+    <w:rPr/>
+  </w:style>
+  <w:style w:type="paragraph" w:styleId="List">
+    <w:name w:val="List"/>
+    <w:basedOn w:val="TextBody"/>
+    <w:pPr/>
+    <w:rPr>
+      <w:rFonts w:cs="Lohit Devanagari"/>
+    </w:rPr>
+  </w:style>
+  <w:style w:type="paragraph" w:styleId="Caption">
+    <w:name w:val="Caption"/>
+    <w:basedOn w:val="Normal"/>
+    <w:qFormat/>
+    <w:pPr>
+      <w:suppressLineNumbers/>
+      <w:spacing w:before="120" w:after="120"/>
+    </w:pPr>
+    <w:rPr>
+      <w:rFonts w:cs="Lohit Devanagari"/>
+      <w:i/>
+      <w:iCs/>
+      <w:sz w:val="24"/>
+      <w:szCs w:val="24"/>
+    </w:rPr>
+  </w:style>
+  <w:style w:type="paragraph" w:styleId="Index">
+    <w:name w:val="Index"/>
+    <w:basedOn w:val="Normal"/>
+    <w:qFormat/>
+    <w:pPr>
+      <w:suppressLineNumbers/>
+    </w:pPr>
+    <w:rPr>
+      <w:rFonts w:cs="Lohit Devanagari"/>
+    </w:rPr>
+  </w:style>
+  <w:style w:type="numbering" w:styleId="NoList" w:default="1">
+    <w:name w:val="No List"/>
+    <w:uiPriority w:val="99"/>
+    <w:semiHidden/>
+    <w:unhideWhenUsed/>
+    <w:qFormat/>
   </w:style>
   <w:style w:type="table" w:default="1" w:styleId="TableNormal">
     <w:name w:val="Normal Table"/>
@@ -1757,7 +1838,6 @@
     <w:semiHidden/>
     <w:unhideWhenUsed/>
     <w:tblPr>
-      <w:tblInd w:w="0" w:type="dxa"/>
       <w:tblCellMar>
         <w:top w:w="0" w:type="dxa"/>
         <w:left w:w="108" w:type="dxa"/>
@@ -1766,25 +1846,19 @@
       </w:tblCellMar>
     </w:tblPr>
   </w:style>
-  <w:style w:type="numbering" w:default="1" w:styleId="NoList">
-    <w:name w:val="No List"/>
-    <w:uiPriority w:val="99"/>
-    <w:semiHidden/>
-    <w:unhideWhenUsed/>
-  </w:style>
   <w:style w:type="table" w:styleId="TableGrid">
     <w:name w:val="Table Grid"/>
     <w:basedOn w:val="TableNormal"/>
     <w:uiPriority w:val="59"/>
-    <w:rsid w:val="003B10EF"/>
+    <w:rsid w:val="003b10ef"/>
     <w:tblPr>
       <w:tblBorders>
-        <w:top w:val="single" w:sz="4" w:space="0" w:color="auto"/>
-        <w:left w:val="single" w:sz="4" w:space="0" w:color="auto"/>
-        <w:bottom w:val="single" w:sz="4" w:space="0" w:color="auto"/>
-        <w:right w:val="single" w:sz="4" w:space="0" w:color="auto"/>
-        <w:insideH w:val="single" w:sz="4" w:space="0" w:color="auto"/>
-        <w:insideV w:val="single" w:sz="4" w:space="0" w:color="auto"/>
+        <w:top w:val="single" w:color="auto" w:sz="4" w:space="0"/>
+        <w:left w:val="single" w:color="auto" w:sz="4" w:space="0"/>
+        <w:bottom w:val="single" w:color="auto" w:sz="4" w:space="0"/>
+        <w:right w:val="single" w:color="auto" w:sz="4" w:space="0"/>
+        <w:insideH w:val="single" w:color="auto" w:sz="4" w:space="0"/>
+        <w:insideV w:val="single" w:color="auto" w:sz="4" w:space="0"/>
       </w:tblBorders>
     </w:tblPr>
   </w:style>
@@ -2087,6 +2161,28 @@
 </file>
 
 <file path=customXml/item1.xml><?xml version="1.0" encoding="utf-8"?>
+<p:properties xmlns:p="http://schemas.microsoft.com/office/2006/metadata/properties" xmlns:xsi="http://www.w3.org/2001/XMLSchema-instance" xmlns:pc="http://schemas.microsoft.com/office/infopath/2007/PartnerControls">
+  <documentManagement>
+    <_ip_UnifiedCompliancePolicyUIAction xmlns="http://schemas.microsoft.com/sharepoint/v3" xsi:nil="true"/>
+    <_ip_UnifiedCompliancePolicyProperties xmlns="http://schemas.microsoft.com/sharepoint/v3" xsi:nil="true"/>
+    <lcf76f155ced4ddcb4097134ff3c332f xmlns="877cd569-5afe-4c79-a79c-fefa2579d9de">
+      <Terms xmlns="http://schemas.microsoft.com/office/infopath/2007/PartnerControls"/>
+    </lcf76f155ced4ddcb4097134ff3c332f>
+    <TaxCatchAll xmlns="78e338ca-bdc9-4d5d-85ca-e5d51d206c55" xsi:nil="true"/>
+  </documentManagement>
+</p:properties>
+</file>
+
+<file path=customXml/item2.xml><?xml version="1.0" encoding="utf-8"?>
+<?mso-contentType ?>
+<FormTemplates xmlns="http://schemas.microsoft.com/sharepoint/v3/contenttype/forms">
+  <Display>DocumentLibraryForm</Display>
+  <Edit>DocumentLibraryForm</Edit>
+  <New>DocumentLibraryForm</New>
+</FormTemplates>
+</file>
+
+<file path=customXml/item3.xml><?xml version="1.0" encoding="utf-8"?>
 <ct:contentTypeSchema xmlns:ct="http://schemas.microsoft.com/office/2006/metadata/contentType" xmlns:ma="http://schemas.microsoft.com/office/2006/metadata/properties/metaAttributes" ct:_="" ma:_="" ma:contentTypeName="Document" ma:contentTypeID="0x010100CE74CCE3EA761F4FB2ECE05E6740826C" ma:contentTypeVersion="22" ma:contentTypeDescription="Create a new document." ma:contentTypeScope="" ma:versionID="363bdbde3249c2d1c8187603616d51bf">
   <xsd:schema xmlns:xsd="http://www.w3.org/2001/XMLSchema" xmlns:xs="http://www.w3.org/2001/XMLSchema" xmlns:p="http://schemas.microsoft.com/office/2006/metadata/properties" xmlns:ns1="http://schemas.microsoft.com/sharepoint/v3" xmlns:ns2="877cd569-5afe-4c79-a79c-fefa2579d9de" xmlns:ns3="78e338ca-bdc9-4d5d-85ca-e5d51d206c55" targetNamespace="http://schemas.microsoft.com/office/2006/metadata/properties" ma:root="true" ma:fieldsID="ecc2c3765018bb73925974a56d08b4bc" ns1:_="" ns2:_="" ns3:_="">
     <xsd:import namespace="http://schemas.microsoft.com/sharepoint/v3"/>
@@ -2358,33 +2454,31 @@
 </ct:contentTypeSchema>
 </file>
 
-<file path=customXml/item2.xml><?xml version="1.0" encoding="utf-8"?>
-<?mso-contentType ?>
-<FormTemplates xmlns="http://schemas.microsoft.com/sharepoint/v3/contenttype/forms">
-  <Display>DocumentLibraryForm</Display>
-  <Edit>DocumentLibraryForm</Edit>
-  <New>DocumentLibraryForm</New>
-</FormTemplates>
-</file>
-
-<file path=customXml/item3.xml><?xml version="1.0" encoding="utf-8"?>
-<p:properties xmlns:p="http://schemas.microsoft.com/office/2006/metadata/properties" xmlns:xsi="http://www.w3.org/2001/XMLSchema-instance" xmlns:pc="http://schemas.microsoft.com/office/infopath/2007/PartnerControls">
-  <documentManagement>
-    <_ip_UnifiedCompliancePolicyUIAction xmlns="http://schemas.microsoft.com/sharepoint/v3" xsi:nil="true"/>
-    <_ip_UnifiedCompliancePolicyProperties xmlns="http://schemas.microsoft.com/sharepoint/v3" xsi:nil="true"/>
-    <lcf76f155ced4ddcb4097134ff3c332f xmlns="877cd569-5afe-4c79-a79c-fefa2579d9de">
-      <Terms xmlns="http://schemas.microsoft.com/office/infopath/2007/PartnerControls"/>
-    </lcf76f155ced4ddcb4097134ff3c332f>
-    <TaxCatchAll xmlns="78e338ca-bdc9-4d5d-85ca-e5d51d206c55" xsi:nil="true"/>
-  </documentManagement>
-</p:properties>
-</file>
-
 <file path=customXml/item4.xml><?xml version="1.0" encoding="utf-8"?>
 <LongProperties xmlns="http://schemas.microsoft.com/office/2006/metadata/longProperties"/>
 </file>
 
 <file path=customXml/itemProps1.xml><?xml version="1.0" encoding="utf-8"?>
+<ds:datastoreItem xmlns:ds="http://schemas.openxmlformats.org/officeDocument/2006/customXml" ds:itemID="{B2BB3C1C-09AF-41D0-8CAA-FA2DD3677824}">
+  <ds:schemaRefs>
+    <ds:schemaRef ds:uri="http://schemas.microsoft.com/office/2006/metadata/properties"/>
+    <ds:schemaRef ds:uri="http://schemas.microsoft.com/office/infopath/2007/PartnerControls"/>
+    <ds:schemaRef ds:uri="http://schemas.microsoft.com/sharepoint/v3"/>
+    <ds:schemaRef ds:uri="877cd569-5afe-4c79-a79c-fefa2579d9de"/>
+    <ds:schemaRef ds:uri="78e338ca-bdc9-4d5d-85ca-e5d51d206c55"/>
+  </ds:schemaRefs>
+</ds:datastoreItem>
+</file>
+
+<file path=customXml/itemProps2.xml><?xml version="1.0" encoding="utf-8"?>
+<ds:datastoreItem xmlns:ds="http://schemas.openxmlformats.org/officeDocument/2006/customXml" ds:itemID="{F28431DD-6E05-408D-805F-EECD20BE582A}">
+  <ds:schemaRefs>
+    <ds:schemaRef ds:uri="http://schemas.microsoft.com/sharepoint/v3/contenttype/forms"/>
+  </ds:schemaRefs>
+</ds:datastoreItem>
+</file>
+
+<file path=customXml/itemProps3.xml><?xml version="1.0" encoding="utf-8"?>
 <ds:datastoreItem xmlns:ds="http://schemas.openxmlformats.org/officeDocument/2006/customXml" ds:itemID="{FBDD07B7-F298-4D57-B3A5-B32C945744B6}">
   <ds:schemaRefs>
     <ds:schemaRef ds:uri="http://schemas.microsoft.com/office/2006/metadata/contentType"/>
@@ -2404,26 +2498,6 @@
 </ds:datastoreItem>
 </file>
 
-<file path=customXml/itemProps2.xml><?xml version="1.0" encoding="utf-8"?>
-<ds:datastoreItem xmlns:ds="http://schemas.openxmlformats.org/officeDocument/2006/customXml" ds:itemID="{F28431DD-6E05-408D-805F-EECD20BE582A}">
-  <ds:schemaRefs>
-    <ds:schemaRef ds:uri="http://schemas.microsoft.com/sharepoint/v3/contenttype/forms"/>
-  </ds:schemaRefs>
-</ds:datastoreItem>
-</file>
-
-<file path=customXml/itemProps3.xml><?xml version="1.0" encoding="utf-8"?>
-<ds:datastoreItem xmlns:ds="http://schemas.openxmlformats.org/officeDocument/2006/customXml" ds:itemID="{B2BB3C1C-09AF-41D0-8CAA-FA2DD3677824}">
-  <ds:schemaRefs>
-    <ds:schemaRef ds:uri="http://schemas.microsoft.com/office/2006/metadata/properties"/>
-    <ds:schemaRef ds:uri="http://schemas.microsoft.com/office/infopath/2007/PartnerControls"/>
-    <ds:schemaRef ds:uri="http://schemas.microsoft.com/sharepoint/v3"/>
-    <ds:schemaRef ds:uri="877cd569-5afe-4c79-a79c-fefa2579d9de"/>
-    <ds:schemaRef ds:uri="78e338ca-bdc9-4d5d-85ca-e5d51d206c55"/>
-  </ds:schemaRefs>
-</ds:datastoreItem>
-</file>
-
 <file path=customXml/itemProps4.xml><?xml version="1.0" encoding="utf-8"?>
 <ds:datastoreItem xmlns:ds="http://schemas.openxmlformats.org/officeDocument/2006/customXml" ds:itemID="{CDF5A017-9064-46B5-A891-7626CB45465F}">
   <ds:schemaRefs>

</xml_diff>